<commit_message>
Refresh docs to match leg-allocator UX overhaul + bug fixes (v1.12.x)
Update lc-payment-wc/README.md and the microservice README's test counts/
coverage numbers, and add a new User Manual section (6.3.1, both EN/CN)
documenting the Debit/Credit Legs Amount waterfall rebalancing rules and the
Account Ccy Equiv. round-trip fix.

Co-Authored-By: Claude Sonnet 5 <noreply@anthropic.com>
</commit_message>
<xml_diff>
--- a/lc-payment-wc/docs/LC-Payment-WC-User-Manual-cn.docx
+++ b/lc-payment-wc/docs/LC-Payment-WC-User-Manual-cn.docx
@@ -8860,7 +8860,7 @@
         <w:spacing w:after="160"/>
       </w:pPr>
       <w:r>
-        <w:t>本应用的第三个顶层标签页 —— Payment Component Simulator —— 与第 2–5 节是完全不同性质的功能：它直接对接 microservices/payment-component 微服务，可从 24 个业务案例（23 个已溯源的 Confirm 按钮函数，加上 1 个经审核确认、非源代码溯源的架构案例 —— 见 §6.7）中任选一个，编辑借/贷分录，并实时观察分类结果、余额校验、分录明细与 SWIFT 报文的重新计算。</w:t>
+        <w:t>本应用的第三个顶层标签页 —— Payment Component Simulator —— 与第 2–5 节是完全不同性质的功能：它直接对接 microservices/payment-component 微服务，可从 23 个业务案例（每个都溯源自遗留系统的 Confirm 按钮函数，或对 RPFM 的部分整合案例而言，溯源自其分类步骤）中任选一个，编辑借/贷分录，并实时观察分类结果、余额校验、分录明细与 SWIFT 报文的重新计算。</w:t>
       </w:r>
     </w:p>
     <w:p>
@@ -8884,7 +8884,7 @@
         <w:pStyle w:val="Heading2"/>
       </w:pPr>
       <w:r>
-        <w:t>6.2 24 个业务案例</w:t>
+        <w:t>6.2 23 个业务案例</w:t>
       </w:r>
     </w:p>
     <w:p>
@@ -9033,7 +9033,7 @@
                 <w:sz w:val="18"/>
                 <w:szCs w:val="18"/>
               </w:rPr>
-              <w:t xml:space="preserve">16</w:t>
+              <w:t>15</w:t>
             </w:r>
           </w:p>
         </w:tc>
@@ -9054,7 +9054,7 @@
                 <w:sz w:val="18"/>
                 <w:szCs w:val="18"/>
               </w:rPr>
-              <w:t xml:space="preserve">已确认的 Payment Component 调用方，源代码中有可运作的分录组装流程 —— 模拟器会端到端驱动真实微服务（即时预览 + 真实 Confirm）。这 16 个当中有 15 个是源代码溯源验证过的；第 16 个（Issue —— Charge Component Bridge，IPLC）则是经审核确认的架构案例，并非源代码溯源 —— 见 §6.7。</w:t>
+              <w:t>已确认的 Payment Component 调用方，源代码中有可运作的分录组装流程 —— 模拟器会端到端驱动真实微服务（即时预览 + 真实 Confirm），这 15 个全部是源代码溯源验证过的。</w:t>
             </w:r>
           </w:p>
         </w:tc>
@@ -9282,6 +9282,94 @@
       </w:pPr>
       <w:r>
         <w:t>N/A 案例会呈现为一张静态说明卡片，引用出处说明该模块为何从不会到达 Payment Component —— 没有表单，也不会调用 API。</w:t>
+      </w:r>
+    </w:p>
+    <w:p>
+      <w:pPr>
+        <w:pStyle w:val="Heading3"/>
+        <w:rPr/>
+      </w:pPr>
+      <w:r>
+        <w:rPr>
+          <w:rtl w:val="0"/>
+        </w:rPr>
+        <w:t>6.3.1 编辑借/贷分录 —— 金额瀑布式重新分配规则（v1.12.3）</w:t>
+      </w:r>
+    </w:p>
+    <w:p>
+      <w:pPr>
+        <w:spacing w:after="160"/>
+      </w:pPr>
+      <w:r>
+        <w:t>每一笔 leg-allocator 分录都可以用三种方式固定为精确数值 —— 其 % 占比、其 Amount (Tx Ccy)，或者当该笔分录自身币别与交易币别不同时，其 Account Ccy Equiv.（以该笔分录自身币别表示）。编辑 % 只会把剩余额度重新分配到自动计算的余额分录（100% 减去其他每一笔的占比）。编辑 Amount (Tx Ccy) 或 Account Ccy Equiv. 则会触发一套“瀑布式”重新平衡机制，确保该侧所有分录的加总永远精确等于总额，规则如下：</w:t>
+      </w:r>
+    </w:p>
+    <w:p>
+      <w:pPr>
+        <w:pStyle w:val="ListParagraph"/>
+        <w:numPr>
+          <w:ilvl w:val="0"/>
+          <w:numId w:val="2"/>
+        </w:numPr>
+        <w:spacing w:after="80"/>
+      </w:pPr>
+      <w:r>
+        <w:t>对任何非最后一笔的分录：增加金额会让最后一笔分录等额减少（上限为最后一笔目前持有的金额）；减少金额则会让最后一笔分录增加等额的释出金额。任何非最后一笔的编辑一律直接对最后一笔生效 —— 绝不会影响紧邻的下一笔或上一笔。</w:t>
+      </w:r>
+    </w:p>
+    <w:p>
+      <w:pPr>
+        <w:pStyle w:val="ListParagraph"/>
+        <w:numPr>
+          <w:ilvl w:val="0"/>
+          <w:numId w:val="2"/>
+        </w:numPr>
+        <w:spacing w:after="80"/>
+      </w:pPr>
+      <w:r>
+        <w:t>对最后一笔分录本身，减少金额会开出一笔全新的分录承接释出的差额，该新分录的 Account No. 会自动带入该账户类型自身的预设值（例如 CUSTOMER 对应 CUST-ACC），而不是留空。</w:t>
+      </w:r>
+    </w:p>
+    <w:p>
+      <w:pPr>
+        <w:pStyle w:val="ListParagraph"/>
+        <w:numPr>
+          <w:ilvl w:val="0"/>
+          <w:numId w:val="2"/>
+        </w:numPr>
+        <w:spacing w:after="80"/>
+      </w:pPr>
+      <w:r>
+        <w:t>对最后一笔分录本身，增加金额会依序向前面的分录取用金额，若单一分录不足以补足差额，会继续往更前面的分录取用，每笔分录最多取到 0（绝不会变成负数）。</w:t>
+      </w:r>
+    </w:p>
+    <w:p>
+      <w:pPr>
+        <w:pStyle w:val="ListParagraph"/>
+        <w:numPr>
+          <w:ilvl w:val="0"/>
+          <w:numId w:val="2"/>
+        </w:numPr>
+        <w:spacing w:after="80"/>
+      </w:pPr>
+      <w:r>
+        <w:t>Amount (Tx Ccy) 与 Account Ccy Equiv. 是同一个底层数值的两种输入方式，因此不论从哪一个栏位编辑，都会套用上述同一套规则。</w:t>
+      </w:r>
+    </w:p>
+    <w:p>
+      <w:pPr>
+        <w:spacing w:after="160"/>
+      </w:pPr>
+      <w:r>
+        <w:t>Account Ccy Equiv. 现在会精确来回一致：直接在该栏位输入的金额（例如汇率 149.0825 下输入 JPY 20000）会原样被记住，重新显示时也会维持不变，而不是每次都从四舍五入后的 Amount (Tx Ccy) 数值重新反推。先前的做法在两种币别的小数位精度无法整除时，可能会悄悄产生一个最小货币单位的落差 —— 例如 JPY 20000 重新显示后变成 19999；直接编辑 Amount (Tx Ccy) 则不受此影响。</w:t>
+      </w:r>
+    </w:p>
+    <w:p>
+      <w:pPr>
+        <w:spacing w:after="160"/>
+      </w:pPr>
+      <w:r>
+        <w:t>一次失败的 Confirm 操作所显示的错误讯息（例如缺少 Account No.）现在会在表单被修正、且下一次即时预览重新计算完成后自动清除 —— 不再需要再按一次 Confirm 才能让不再适用的旧错误讯息消失。</w:t>
       </w:r>
     </w:p>
     <w:p>
@@ -9852,169 +9940,6 @@
       </w:pPr>
       <w:r>
         <w:t>这些都是透过一般的 debitLegs/creditLegs 阵列送出的普通 PaymentLegInput 分录 —— 此功能不需要任何后端改动（accountType SUSPENSE 与 INTERNAL 在 OAS 中本来就已存在）。</w:t>
-      </w:r>
-    </w:p>
-    <w:p>
-      <w:pPr>
-        <w:pStyle w:val="Heading2"/>
-      </w:pPr>
-      <w:r>
-        <w:t>6.7 chargeBridge 案例：没有真正的贷方分录（Issue —— Charge Component Bridge）</w:t>
-      </w:r>
-    </w:p>
-    <w:p>
-      <w:pPr>
-        <w:spacing w:after="160"/>
-      </w:pPr>
-      <w:r>
-        <w:t>经业务需求审核确认（2026-08-09），非 FSD 溯源内容。IPLC 模块中有一个案例 ——“Issue —— Charge Component Bridge”（id 为 iplc-issue-charge-bridge）—— 被标记为 chargeBridge: true（BusinessCaseConfig.chargeBridge），其行为与其他所有案例不同，包括上方 §6.6 所述的一般 Suspense Debit / Suspense Credit 机制。它模拟的是 Payment Component 纯粹作为资金/清算桥梁，对接一个独立的 Charge Component（本仓库未建模）——该组件会在自己的账上记 Dr Suspense - Credit / Cr Margin、Cr Commission、Cr Charge 1、Cr Charge 2。本 Payment Component 则只会记 Dr Customer A/C / Cr Suspense - Credit —— 刻意不存在任何真正的贷方分录。</w:t>
-      </w:r>
-    </w:p>
-    <w:p>
-      <w:pPr>
-        <w:pStyle w:val="ListParagraph"/>
-        <w:numPr>
-          <w:ilvl w:val="0"/>
-          <w:numId w:val="2"/>
-        </w:numPr>
-        <w:spacing w:after="80"/>
-      </w:pPr>
-      <w:r>
-        <w:t>完全没有贷方分录网格。此案例的贷方 &lt;app-leg-allocator&gt; 网格被整个隐藏 —— 贷方一侧完全改由 Suspense Credit 条目提供。</w:t>
-      </w:r>
-    </w:p>
-    <w:p>
-      <w:pPr>
-        <w:pStyle w:val="ListParagraph"/>
-        <w:numPr>
-          <w:ilvl w:val="0"/>
-          <w:numId w:val="2"/>
-        </w:numPr>
-        <w:spacing w:after="80"/>
-      </w:pPr>
-      <w:r>
-        <w:t>Suspense Debit 也被隐藏 —— 在此模式下不适用，因为纯粹的收费桥接情境并没有对应的借方 Suspense 概念。只会显示 Suspense Credit 的重复输入组件。</w:t>
-      </w:r>
-    </w:p>
-    <w:p>
-      <w:pPr>
-        <w:pStyle w:val="ListParagraph"/>
-        <w:numPr>
-          <w:ilvl w:val="0"/>
-          <w:numId w:val="2"/>
-        </w:numPr>
-        <w:spacing w:after="80"/>
-      </w:pPr>
-      <w:r>
-        <w:t>Transaction Amount 为保护状态（唯读），不可手动输入，而是自动计算为所有 Suspense Credit 条目的 Trx Ccy Equivalent 总和 —— 借方是由 Suspense Credit 反推出来的，而不是像其他案例那样反过来。当尚未输入任何 Suspense Credit 条目时，计算出的总额为 0，即时预览会显示"尚未就绪"，与其他未完成案例的表现一致。</w:t>
-      </w:r>
-    </w:p>
-    <w:p>
-      <w:pPr>
-        <w:pStyle w:val="ListParagraph"/>
-        <w:numPr>
-          <w:ilvl w:val="0"/>
-          <w:numId w:val="2"/>
-        </w:numPr>
-        <w:spacing w:after="80"/>
-      </w:pPr>
-      <w:r>
-        <w:t>Suspense Credit 条目在本模拟器中是手动输入的（目前尚无真实的 Charge Component 可供调用），作为正式环境的替代方案 —— 正式环境中这些条目应会由 Charge Component 自身的结果自动带入。</w:t>
-      </w:r>
-    </w:p>
-    <w:p>
-      <w:pPr>
-        <w:spacing w:before="160" w:after="160"/>
-      </w:pPr>
-      <w:r>
-        <w:t>在传输层面，模拟器会送出 chargeComponentBridge: true，并附上一个空的 creditLegs 阵列 —— 微服务的请求 schema 只在这个组合下（且仅当 suspenseBridge.creditEntries 非空时）放宽其原本"creditLegs 至少要有 1 笔"的规则。FX Exchange 分录接着会依照每个币别的差额来计算大小，而不是毛额 —— 差额是 Suspense Credit 与对应贷方分录之间的差：</w:t>
-      </w:r>
-    </w:p>
-    <w:tbl>
-      <w:tblPr>
-        <w:tblW w:w="9350" w:type="dxa"/>
-        <w:tblBorders>
-          <w:top w:val="single" w:sz="4" w:space="0" w:color="2563EB"/>
-          <w:left w:val="single" w:sz="24" w:space="0" w:color="2563EB"/>
-          <w:bottom w:val="single" w:sz="4" w:space="0" w:color="E2E8F0"/>
-          <w:right w:val="single" w:sz="4" w:space="0" w:color="E2E8F0"/>
-          <w:insideH w:val="none" w:sz="0" w:space="0" w:color="FFFFFF"/>
-          <w:insideV w:val="none" w:sz="0" w:space="0" w:color="FFFFFF"/>
-        </w:tblBorders>
-        <w:tblCellMar>
-          <w:left w:w="10" w:type="dxa"/>
-          <w:right w:w="10" w:type="dxa"/>
-        </w:tblCellMar>
-        <w:tblLook w:val="04A0" w:firstRow="1" w:lastRow="0" w:firstColumn="1" w:lastColumn="0" w:noHBand="0" w:noVBand="1"/>
-      </w:tblPr>
-      <w:tblGrid>
-        <w:gridCol w:w="9350"/>
-      </w:tblGrid>
-      <w:tr>
-        <w:tc>
-          <w:tcPr>
-            <w:tcW w:w="9350" w:type="dxa"/>
-            <w:shd w:val="clear" w:color="auto" w:fill="F1F5F9"/>
-            <w:tcMar>
-              <w:top w:w="140" w:type="dxa"/>
-              <w:left w:w="200" w:type="dxa"/>
-              <w:bottom w:w="140" w:type="dxa"/>
-              <w:right w:w="200" w:type="dxa"/>
-            </w:tcMar>
-          </w:tcPr>
-          <w:p>
-            <w:r>
-              <w:rPr>
-                <w:rFonts w:ascii="Consolas" w:eastAsia="Consolas" w:hAnsi="Consolas" w:cs="Consolas"/>
-                <w:color w:val="1E293B"/>
-                <w:sz w:val="18"/>
-                <w:szCs w:val="18"/>
-              </w:rPr>
-              <w:t xml:space="preserve">diff = Suspense Credit（按币别）− 对应的贷方分录（按币别）</w:t>
-            </w:r>
-          </w:p>
-          <w:p>
-            <w:r>
-              <w:rPr>
-                <w:rFonts w:ascii="Consolas" w:eastAsia="Consolas" w:hAnsi="Consolas" w:cs="Consolas"/>
-                <w:color w:val="1E293B"/>
-                <w:sz w:val="18"/>
-                <w:szCs w:val="18"/>
-              </w:rPr>
-              <w:t xml:space="preserve">diff = 0  -&gt; 该币别完全不产生 FX Exchange 分录</w:t>
-            </w:r>
-          </w:p>
-          <w:p>
-            <w:r>
-              <w:rPr>
-                <w:rFonts w:ascii="Consolas" w:eastAsia="Consolas" w:hAnsi="Consolas" w:cs="Consolas"/>
-                <w:color w:val="1E293B"/>
-                <w:sz w:val="18"/>
-                <w:szCs w:val="18"/>
-              </w:rPr>
-              <w:t xml:space="preserve">diff &gt; 0  -&gt; FX 配对只反映差额（若完全没有对应贷方分录，则为全额）</w:t>
-            </w:r>
-          </w:p>
-          <w:p>
-            <w:r>
-              <w:rPr>
-                <w:rFonts w:ascii="Consolas" w:eastAsia="Consolas" w:hAnsi="Consolas" w:cs="Consolas"/>
-                <w:color w:val="1E293B"/>
-                <w:sz w:val="18"/>
-                <w:szCs w:val="18"/>
-              </w:rPr>
-              <w:t xml:space="preserve">diff &lt; 0  -&gt; FX 配对（方向相反）只反映超出的差额</w:t>
-            </w:r>
-          </w:p>
-        </w:tc>
-      </w:tr>
-    </w:tbl>
-    <w:p>
-      <w:pPr>
-        <w:spacing w:before="160" w:after="160"/>
-      </w:pPr>
-      <w:r>
-        <w:t>范例：Suspense Credit 为 USD 100 + EUR 200，对应贷方分录为 USD 80+20 与 EUR 200 —— 每个币别都已经完全对上，因此 Settlement Vouchers 表格完全不会出现任何 FX Exchange 分录，只会有各币别的 Dr Customer A/C 与 Cr Suspense - Credit 分录。若真的对不上且没有其他分录补偿差额，仍会照常回传 409 LEGS_UNBALANCED —— 这个计算规则只会移除本来就多余的 FX 配对，绝不会掩盖真正的失衡。完整的会计逻辑与更多范例，请见 lc-payment-wc/CLAUDE.md（"Charge Component ↔ Payment Component boundary" 一节）与微服务自身的 README.md。</w:t>
       </w:r>
     </w:p>
     <w:p>

</xml_diff>

<commit_message>
Leg-allocator UI/UX enhancement: % input gets its own waterfall + auto-delete-on-zero rows (v1.13.0)
Debit/Credit Legs % editing now mirrors the Amount waterfall's 4-rule model
(non-last row edits always target the last row; last-row decrease opens a new
row; last-row increase draws backward), with % constrained to whole
percentage points (1% steps) so a finer split still requires the Amount
field. Both waterfalls also now auto-delete any row that settles at 0%/0
amount instead of leaving a dangling empty leg on screen.

Updates the User Manual (EN/CN) accordingly, including a correction to the
previously-stale §6.6 Suspense Debit/Credit description (it referenced the
pre-v1.4.0 client-side computation), plus new usage-guidance sections for LC
Issue/Amendment fee collection and IBL/EBL Takedown/Repayment.

Co-Authored-By: Claude Sonnet 5 <noreply@anthropic.com>
</commit_message>
<xml_diff>
--- a/lc-payment-wc/docs/LC-Payment-WC-User-Manual-cn.docx
+++ b/lc-payment-wc/docs/LC-Payment-WC-User-Manual-cn.docx
@@ -9301,7 +9301,7 @@
         <w:spacing w:after="160"/>
       </w:pPr>
       <w:r>
-        <w:t>每一笔 leg-allocator 分录都可以用三种方式固定为精确数值 —— 其 % 占比、其 Amount (Tx Ccy)，或者当该笔分录自身币别与交易币别不同时，其 Account Ccy Equiv.（以该笔分录自身币别表示）。编辑 % 只会把剩余额度重新分配到自动计算的余额分录（100% 减去其他每一笔的占比）。编辑 Amount (Tx Ccy) 或 Account Ccy Equiv. 则会触发一套“瀑布式”重新平衡机制，确保该侧所有分录的加总永远精确等于总额，规则如下：</w:t>
+        <w:t>每一笔 leg-allocator 分录都可以用三种方式固定为精确数值 —— 其 % 占比、其 Amount (Tx Ccy)，或者当该笔分录自身币别与交易币别不同时，其 Account Ccy Equiv.（以该笔分录自身币别表示）。只要该侧已拆分为多笔分录，编辑这三者中的任何一个都会触发一套“瀑布式”重新平衡机制，确保该侧所有分录的加总永远精确等于总额，规则如下（% 的瀑布式规则另见 §6.3.2 —— 完全相同的四条规则，只是作用对象换成 % 占比）：</w:t>
       </w:r>
     </w:p>
     <w:p>
@@ -9357,6 +9357,12 @@
       </w:r>
     </w:p>
     <w:p>
+      <w:pPr/>
+      <w:r>
+        <w:t>任何一笔分录只要同时落在 0% 与 0 金额，就会立即从网格中整笔移除 —— 不论是被回补式串接扣到 0、被「对齐最后一笔」规则剛好扣到 0，还是使用者直接把它调降到 0 —— 因为这种空分录本来就已经被排除在送往微服务的内容之外，留在画面上只会造成视觉干扰。唯一的例外是该侧尚未拆分时的唯一一笔：在这个情况下输入 0 仍会让该笔显示为 0（并在旁边自动生成一笔全新的 100% 余额分录），而不会消失。</w:t>
+      </w:r>
+    </w:p>
+    <w:p>
       <w:pPr>
         <w:spacing w:after="160"/>
       </w:pPr>
@@ -9370,6 +9376,38 @@
       </w:pPr>
       <w:r>
         <w:t>一次失败的 Confirm 操作所显示的错误讯息（例如缺少 Account No.）现在会在表单被修正、且下一次即时预览重新计算完成后自动清除 —— 不再需要再按一次 Confirm 才能让不再适用的旧错误讯息消失。</w:t>
+      </w:r>
+    </w:p>
+    <w:p>
+      <w:pPr>
+        <w:pStyle w:val="Heading3"/>
+      </w:pPr>
+      <w:r>
+        <w:t>6.3.2 编辑借/贷分录 —— 百分比（%）瀑布式重新分配规则（仅限整数百分点）</w:t>
+      </w:r>
+    </w:p>
+    <w:p>
+      <w:pPr/>
+      <w:r>
+        <w:t>编辑分录的 % 会套用与 §6.3.1 相同的四条瀑布式规则，只是作用对象从金额换成 % 占比：任何非最后一笔的增加或减少一律直接对最后一笔生效 —— 绝不会影响紧邻的下一笔或上一笔；减少最后一笔会开出一笔全新的分录承接释出的差额，其 Account No. 预设值的带入方式与 Amount 瀑布式规则的新分录相同；增加最后一笔会依序向前面的分录取用，若单一分录不足以补足差额，会继续往更前面的分录取用。任何一笔的 % 都不会变成负数，所有分录的 % 加总也永远不会超过 100% —— 这两点都是这套机制本身的结构性保证，而非额外的验证逻辑。</w:t>
+      </w:r>
+    </w:p>
+    <w:p>
+      <w:pPr/>
+      <w:r>
+        <w:t>% 只能以整数百分点为单位调整（每次 1%）。栏位原生的上下箭头会精确地以 ±1% 调整，直接输入整数也能一次到位完成较大幅度的调整。若需要比 1% 更精细的拆分，请改用 Amount (Tx Ccy) 或 Account Ccy Equiv. 栏位 —— 输入非整数的 % 会先四舍五入到最接近的整数百分点，才会套用瀑布式规则。</w:t>
+      </w:r>
+    </w:p>
+    <w:p>
+      <w:pPr/>
+      <w:r>
+        <w:t>任何一笔分录只要同时落在 0% 与 0 金额，也会同样被整笔移除 —— 与 Amount 瀑布式规则完全相同，细节与唯一例外（尚未拆分的唯一一笔）请见 §6.3.1。</w:t>
+      </w:r>
+    </w:p>
+    <w:p>
+      <w:pPr/>
+      <w:r>
+        <w:t>由于该侧一旦拆分为多笔分录后，% 的加总在这套机制下永远精确等于 100%，单靠编辑 % 栏位已经无法再刻意做出过度分配（超过 100%）的状态。若透过其他方式真的出现过度分配，Total Allocated 警示仍会照常显示，但 % 编辑本身不会再制造出这种状态。</w:t>
       </w:r>
     </w:p>
     <w:p>
@@ -9843,7 +9881,7 @@
         <w:spacing w:after="160"/>
       </w:pPr>
       <w:r>
-        <w:t>NOT FSD-sourced —— 一个仅存在于 Simulator 的扩展，用于模拟外部“Charge Component”（会记 Dr Suspense - Debit / Dr Suspense - Credit，对应 Cr Commission 科目）与本 Payment Component 之间的记账桥接。两个 &lt;app-suspense-entries&gt; 重复输入组件会显示在 Unit Code 那一行下方 —— Suspense Debit 与 Suspense Credit —— 每一个都是可选的金额+币别条目列表。每一侧都可以有多笔条目（例如多笔不同币别的 Charge Component 手续费明细）。</w:t>
+        <w:t>NOT FSD-sourced —— 一个仅存在于 Simulator 的扩展，用于模拟外部“Charge Component”（会记 Dr Suspense - Debit / Dr Suspense - Credit，对应 Cr Commission 科目）与本 Payment Component 之间的记账桥接。Unit Code 列下方会出现两个 &lt;app-suspense-entries&gt; 重复区块 —— Suspense Debit 与 Suspense Credit —— 各自是一份可选的「金额＋币别」条目清单，每一侧都可以有多笔条目（例如多笔不同币别的 Charge Component 佣金）。白话说明：Suspense Debit 条目代表银行向客户多扣款 —— 会增加在 Debit 那一侧的总额；Suspense Credit 条目代表银行少给客户 —— 会减少在 Credit 那一侧的总额。</w:t>
       </w:r>
     </w:p>
     <w:tbl>
@@ -9926,7 +9964,7 @@
         <w:spacing w:after="80"/>
       </w:pPr>
       <w:r>
-        <w:t>当某条目自身币别与交易币别不同时，会额外加入一组对应的 FX Exchange 配平分录（accountType 为 INTERNAL），让传票不仅在交易币别等值层面平衡，也能按各别币别平衡 —— 完整的推导过程见 business-case-runner.component.ts 的 suspenseBridgeLeg() / fxExchangePairLegs() / suspenseBridgeLegs() 文件注释。</w:t>
+        <w:t>当某条目自身币别与交易币别不同时，会额外加入一组对应的 FX Exchange 配平分录（accountType 为 INTERNAL），让传票不仅在交易币别等值层面平衡，也能按各别币别平衡。自 v1.4.0 起，这套配平逻辑已改在服务器端执行，不再由前端计算 —— 完整的推导过程请见微服务自身的 domain/suspenseBridge.ts（expandSuspenseBridge() / buildSuspenseBridgeLeg()）；本节先前引用的前端函数（suspenseBridgeLeg() / fxExchangePairLegs() / suspenseBridgeLegs()）已原封不动搬移到该处，前端本身不再做任何计算。</w:t>
       </w:r>
     </w:p>
     <w:p>
@@ -9939,7 +9977,35 @@
         <w:spacing w:after="80"/>
       </w:pPr>
       <w:r>
-        <w:t>这些都是透过一般的 debitLegs/creditLegs 阵列送出的普通 PaymentLegInput 分录 —— 此功能不需要任何后端改动（accountType SUSPENSE 与 INTERNAL 在 OAS 中本来就已存在）。</w:t>
+        <w:t>自 v1.4.0 起，这些条目会以一个专属的 suspenseBridge 请求栏位送出（由 business-case-runner.component.ts 的 buildSuspenseBridgeEntries() / buildSuspenseBridge() 组装），而不是当作普通的 PaymentLegInput 条目放进 debitLegs/creditLegs —— 实际的 Suspense/FX-Exchange 分录改由微服务自己从 suspenseBridge 展开产生（accountType SUSPENSE 与 INTERNAL 在 OAS 中本来就已存在）。较早版本的 Simulator 曾经直接在前端组好这些分录再送出；自从服务器端接手同一套配平逻辑后，那条路径已经停用。</w:t>
+      </w:r>
+    </w:p>
+    <w:p>
+      <w:pPr>
+        <w:pStyle w:val="Heading3"/>
+      </w:pPr>
+      <w:r>
+        <w:t>6.6.1 LC Issue / LC Amendment —— 向客户收取费用（使用指引，尚非登记案例）</w:t>
+      </w:r>
+    </w:p>
+    <w:p>
+      <w:pPr/>
+      <w:r>
+        <w:t>尚未接入 Simulator 自己的业务案例选择器 —— 没有溯源引用、没有预设账号、除了服务器自身的单元测试外没有回归测试 —— 但底下的请求格式已对照目前服务器契约确认无误。单纯的 LC Issue/Amendment 收费请求没有独立的交易本金：Debit 分录本身就是费用总额（例如 USD 25.00 从客户的活期账户扣款，或者改从卖方的 Nostro 收款中扣除 —— 二者择一，绝不同时使用），Credit Legs 留空（自 v1.10.1 起有效 —— 见 §6.4 的「creditLegs 可为空」说明），再用一笔 suspenseBridge.creditEntries 条目（相同金额与币别）告知服务器产生对应的 Cr Suspense - Credit 抵销分录 —— 该分录会直接与真实的 Dr Customer A/C 分录配平，不需要任何额外调整。</w:t>
+      </w:r>
+    </w:p>
+    <w:p>
+      <w:pPr>
+        <w:pStyle w:val="Heading3"/>
+      </w:pPr>
+      <w:r>
+        <w:t>6.6.2 IBL/EBL 提款（Takedown）与还款（Repayment）（使用指引，尚非登记案例）</w:t>
+      </w:r>
+    </w:p>
+    <w:p>
+      <w:pPr/>
+      <w:r>
+        <w:t>同样尚未成为 Simulator 的业务案例。Takedown（贷款/负债放款 —— 资金流向客户）需要一笔真实的 Debit 分录，accountType 为 SUSPENSE —— 绝不能由 suspenseBridge 产生（桥接分录一律为贷方方向），并搭配真正付款出去的 Credit 分录；若存在可选的 Trx Charges suspenseBridge.creditEntries 条目，必须让该 Credit 分录自身的金额扣除费用 —— 漏掉这个调整会得到 409 平衡错误，而不是 400 验证错误（代表请求格式本身没问题，只是金额差了费用那一笔）。Repayment 则与 Takedown 对称：资金由客户流入，因此需要一笔真实的 Credit 分录，accountType 为 SUSPENSE，若存在可选的 Trx Charges suspenseBridge.debitEntries 条目，则改为让对应的 Debit 分录自身金额加上费用。完整的请求格式范例请见微服务 README 自身的「Extended usage scenarios」章节。</w:t>
       </w:r>
     </w:p>
     <w:p>

</xml_diff>